<commit_message>
spring revision updatae webhooks and some optimization things
</commit_message>
<xml_diff>
--- a/Spring Boot Complete Revision.docx
+++ b/Spring Boot Complete Revision.docx
@@ -24727,56 +24727,1655 @@
     <w:p>
       <w:pPr>
         <w:rPr>
-          <w:sz w:val="32"/>
-          <w:szCs w:val="32"/>
-        </w:rPr>
-      </w:pPr>
-    </w:p>
-    <w:p>
-      <w:pPr>
-        <w:rPr>
-          <w:sz w:val="32"/>
-          <w:szCs w:val="32"/>
-        </w:rPr>
-      </w:pPr>
-    </w:p>
-    <w:p>
-      <w:pPr>
-        <w:rPr>
-          <w:sz w:val="32"/>
-          <w:szCs w:val="32"/>
-        </w:rPr>
-      </w:pPr>
-    </w:p>
-    <w:p>
-      <w:pPr>
-        <w:rPr>
-          <w:sz w:val="32"/>
-          <w:szCs w:val="32"/>
-        </w:rPr>
-      </w:pPr>
-    </w:p>
-    <w:p>
-      <w:pPr>
-        <w:rPr>
-          <w:sz w:val="32"/>
-          <w:szCs w:val="32"/>
-        </w:rPr>
-      </w:pPr>
-    </w:p>
-    <w:p>
-      <w:pPr>
-        <w:rPr>
-          <w:sz w:val="26"/>
-          <w:szCs w:val="26"/>
-        </w:rPr>
-      </w:pPr>
+          <w:b/>
+          <w:bCs/>
+          <w:sz w:val="42"/>
+          <w:szCs w:val="42"/>
+        </w:rPr>
+      </w:pPr>
+      <w:r>
+        <w:rPr>
+          <w:b/>
+          <w:bCs/>
+          <w:sz w:val="42"/>
+          <w:szCs w:val="42"/>
+        </w:rPr>
+        <w:t>JPA optimization:</w:t>
+      </w:r>
+    </w:p>
+    <w:p>
+      <w:pPr>
+        <w:rPr>
+          <w:b/>
+          <w:bCs/>
+        </w:rPr>
+      </w:pPr>
+      <w:r>
+        <w:rPr>
+          <w:b/>
+          <w:bCs/>
+        </w:rPr>
+        <w:t>1)Batch Processing:</w:t>
+      </w:r>
+    </w:p>
+    <w:p>
+      <w:pPr>
+        <w:rPr>
+          <w:sz w:val="22"/>
+          <w:szCs w:val="22"/>
+        </w:rPr>
+      </w:pPr>
+      <w:r>
+        <w:rPr>
+          <w:sz w:val="22"/>
+          <w:szCs w:val="22"/>
+        </w:rPr>
+        <w:t>a) Batch Fetching:</w:t>
+      </w:r>
+    </w:p>
+    <w:p>
+      <w:pPr>
+        <w:rPr>
+          <w:sz w:val="22"/>
+          <w:szCs w:val="22"/>
+        </w:rPr>
+      </w:pPr>
+      <w:r>
+        <w:rPr>
+          <w:sz w:val="22"/>
+          <w:szCs w:val="22"/>
+        </w:rPr>
+        <w:t xml:space="preserve">Batch Fetching is a Hibernate </w:t>
+      </w:r>
+      <w:proofErr w:type="spellStart"/>
+      <w:r>
+        <w:rPr>
+          <w:sz w:val="22"/>
+          <w:szCs w:val="22"/>
+        </w:rPr>
+        <w:t>optimisation</w:t>
+      </w:r>
+      <w:proofErr w:type="spellEnd"/>
+      <w:r>
+        <w:rPr>
+          <w:sz w:val="22"/>
+          <w:szCs w:val="22"/>
+        </w:rPr>
+        <w:t xml:space="preserve"> that reduces the N+1 query problem by grouping multiple lazy-loaded entity fetches into fewer SQL queries using an IN clause. It keeps associations lazy while significantly reducing database round trips.</w:t>
+      </w:r>
+    </w:p>
+    <w:p>
+      <w:pPr>
+        <w:rPr>
+          <w:sz w:val="22"/>
+          <w:szCs w:val="22"/>
+        </w:rPr>
+      </w:pPr>
+      <w:r>
+        <w:rPr>
+          <w:sz w:val="22"/>
+          <w:szCs w:val="22"/>
+        </w:rPr>
+        <w:t>Let say we have 2 entities Employee and Department, the fetch type is LAZY.</w:t>
+      </w:r>
+    </w:p>
+    <w:p>
+      <w:pPr>
+        <w:rPr>
+          <w:sz w:val="22"/>
+          <w:szCs w:val="22"/>
+        </w:rPr>
+      </w:pPr>
+      <w:r>
+        <w:rPr>
+          <w:sz w:val="22"/>
+          <w:szCs w:val="22"/>
+        </w:rPr>
+        <w:t xml:space="preserve">When we do </w:t>
+      </w:r>
+      <w:proofErr w:type="spellStart"/>
+      <w:proofErr w:type="gramStart"/>
+      <w:r>
+        <w:rPr>
+          <w:sz w:val="22"/>
+          <w:szCs w:val="22"/>
+        </w:rPr>
+        <w:t>getEmployee</w:t>
+      </w:r>
+      <w:proofErr w:type="spellEnd"/>
+      <w:r>
+        <w:rPr>
+          <w:sz w:val="22"/>
+          <w:szCs w:val="22"/>
+        </w:rPr>
+        <w:t>(</w:t>
+      </w:r>
+      <w:proofErr w:type="gramEnd"/>
+      <w:r>
+        <w:rPr>
+          <w:sz w:val="22"/>
+          <w:szCs w:val="22"/>
+        </w:rPr>
+        <w:t>) all the departments won’t get loaded until we ask as it is LAZY.</w:t>
+      </w:r>
+    </w:p>
+    <w:p>
+      <w:pPr>
+        <w:rPr>
+          <w:sz w:val="22"/>
+          <w:szCs w:val="22"/>
+        </w:rPr>
+      </w:pPr>
+      <w:r>
+        <w:rPr>
+          <w:sz w:val="22"/>
+          <w:szCs w:val="22"/>
+        </w:rPr>
+        <w:t xml:space="preserve">And when we call </w:t>
+      </w:r>
+      <w:proofErr w:type="spellStart"/>
+      <w:proofErr w:type="gramStart"/>
+      <w:r>
+        <w:rPr>
+          <w:sz w:val="22"/>
+          <w:szCs w:val="22"/>
+        </w:rPr>
+        <w:t>employee.getDepartment.getName</w:t>
+      </w:r>
+      <w:proofErr w:type="spellEnd"/>
+      <w:proofErr w:type="gramEnd"/>
+      <w:r>
+        <w:rPr>
+          <w:sz w:val="22"/>
+          <w:szCs w:val="22"/>
+        </w:rPr>
+        <w:t xml:space="preserve">(); it will then return department on that particular employee </w:t>
+      </w:r>
+    </w:p>
+    <w:p>
+      <w:pPr>
+        <w:rPr>
+          <w:b/>
+          <w:bCs/>
+          <w:sz w:val="22"/>
+          <w:szCs w:val="22"/>
+        </w:rPr>
+      </w:pPr>
+      <w:r>
+        <w:rPr>
+          <w:sz w:val="22"/>
+          <w:szCs w:val="22"/>
+        </w:rPr>
+        <w:t xml:space="preserve">And for n employee we call it n times and it causes </w:t>
+      </w:r>
+      <w:r>
+        <w:rPr>
+          <w:b/>
+          <w:bCs/>
+          <w:sz w:val="22"/>
+          <w:szCs w:val="22"/>
+          <w:highlight w:val="yellow"/>
+        </w:rPr>
+        <w:t>N+1 query problem</w:t>
+      </w:r>
+      <w:r>
+        <w:rPr>
+          <w:b/>
+          <w:bCs/>
+          <w:sz w:val="22"/>
+          <w:szCs w:val="22"/>
+        </w:rPr>
+        <w:t>.</w:t>
+      </w:r>
+    </w:p>
+    <w:p>
+      <w:pPr>
+        <w:rPr>
+          <w:sz w:val="22"/>
+          <w:szCs w:val="22"/>
+        </w:rPr>
+      </w:pPr>
+      <w:r>
+        <w:rPr>
+          <w:sz w:val="22"/>
+          <w:szCs w:val="22"/>
+        </w:rPr>
+        <w:t xml:space="preserve">Means for 1 parent query (all employees) we are running queries for </w:t>
+      </w:r>
+      <w:proofErr w:type="gramStart"/>
+      <w:r>
+        <w:rPr>
+          <w:sz w:val="22"/>
+          <w:szCs w:val="22"/>
+        </w:rPr>
+        <w:t>it(</w:t>
+      </w:r>
+      <w:proofErr w:type="gramEnd"/>
+      <w:r>
+        <w:rPr>
+          <w:sz w:val="22"/>
+          <w:szCs w:val="22"/>
+        </w:rPr>
+        <w:t>department of emp).</w:t>
+      </w:r>
+    </w:p>
+    <w:p>
+      <w:pPr>
+        <w:rPr>
+          <w:b/>
+          <w:bCs/>
+          <w:sz w:val="22"/>
+          <w:szCs w:val="22"/>
+        </w:rPr>
+      </w:pPr>
+      <w:r>
+        <w:rPr>
+          <w:sz w:val="22"/>
+          <w:szCs w:val="22"/>
+        </w:rPr>
+        <w:t xml:space="preserve">We can resolve this problem by using </w:t>
+      </w:r>
+      <w:r>
+        <w:rPr>
+          <w:b/>
+          <w:bCs/>
+          <w:sz w:val="22"/>
+          <w:szCs w:val="22"/>
+          <w:highlight w:val="yellow"/>
+        </w:rPr>
+        <w:t>Batch Fetching</w:t>
+      </w:r>
+      <w:r>
+        <w:rPr>
+          <w:b/>
+          <w:bCs/>
+          <w:sz w:val="22"/>
+          <w:szCs w:val="22"/>
+        </w:rPr>
+        <w:t>.</w:t>
+      </w:r>
+    </w:p>
+    <w:p>
+      <w:pPr>
+        <w:rPr>
+          <w:sz w:val="22"/>
+          <w:szCs w:val="22"/>
+        </w:rPr>
+      </w:pPr>
+      <w:r>
+        <w:rPr>
+          <w:sz w:val="22"/>
+          <w:szCs w:val="22"/>
+        </w:rPr>
+        <w:lastRenderedPageBreak/>
+        <w:t xml:space="preserve"> In this hibernate does not only loads one department it checks are there more unutilized indexes.</w:t>
+      </w:r>
+    </w:p>
+    <w:p>
+      <w:pPr>
+        <w:rPr>
+          <w:sz w:val="22"/>
+          <w:szCs w:val="22"/>
+        </w:rPr>
+      </w:pPr>
+      <w:r>
+        <w:rPr>
+          <w:sz w:val="22"/>
+          <w:szCs w:val="22"/>
+        </w:rPr>
+        <w:t>Suppose there are 10. Then it loads all 10 together.</w:t>
+      </w:r>
+    </w:p>
+    <w:p>
+      <w:pPr>
+        <w:rPr>
+          <w:sz w:val="22"/>
+          <w:szCs w:val="22"/>
+        </w:rPr>
+      </w:pPr>
+      <w:r>
+        <w:rPr>
+          <w:sz w:val="22"/>
+          <w:szCs w:val="22"/>
+        </w:rPr>
+        <w:t>Methods of enabling batch processing:</w:t>
+      </w:r>
+      <w:r>
+        <w:rPr>
+          <w:sz w:val="22"/>
+          <w:szCs w:val="22"/>
+        </w:rPr>
+        <w:br/>
+      </w:r>
+      <w:proofErr w:type="gramStart"/>
+      <w:r>
+        <w:rPr>
+          <w:sz w:val="22"/>
+          <w:szCs w:val="22"/>
+        </w:rPr>
+        <w:t>1)Annotation</w:t>
+      </w:r>
+      <w:proofErr w:type="gramEnd"/>
+      <w:r>
+        <w:rPr>
+          <w:sz w:val="22"/>
+          <w:szCs w:val="22"/>
+        </w:rPr>
+        <w:t xml:space="preserve"> based:</w:t>
+      </w:r>
+    </w:p>
+    <w:p>
+      <w:pPr>
+        <w:rPr>
+          <w:sz w:val="22"/>
+          <w:szCs w:val="22"/>
+        </w:rPr>
+      </w:pPr>
+      <w:r>
+        <w:rPr>
+          <w:sz w:val="22"/>
+          <w:szCs w:val="22"/>
+        </w:rPr>
+        <w:t>@</w:t>
+      </w:r>
+      <w:proofErr w:type="gramStart"/>
+      <w:r>
+        <w:rPr>
+          <w:sz w:val="22"/>
+          <w:szCs w:val="22"/>
+        </w:rPr>
+        <w:t>ManyToOne(</w:t>
+      </w:r>
+      <w:proofErr w:type="gramEnd"/>
+      <w:r>
+        <w:rPr>
+          <w:sz w:val="22"/>
+          <w:szCs w:val="22"/>
+        </w:rPr>
+        <w:t xml:space="preserve">fetch = </w:t>
+      </w:r>
+      <w:proofErr w:type="spellStart"/>
+      <w:r>
+        <w:rPr>
+          <w:sz w:val="22"/>
+          <w:szCs w:val="22"/>
+        </w:rPr>
+        <w:t>FetchType.LAZY</w:t>
+      </w:r>
+      <w:proofErr w:type="spellEnd"/>
+      <w:r>
+        <w:rPr>
+          <w:sz w:val="22"/>
+          <w:szCs w:val="22"/>
+        </w:rPr>
+        <w:t>)</w:t>
+      </w:r>
+    </w:p>
+    <w:p>
+      <w:pPr>
+        <w:rPr>
+          <w:sz w:val="22"/>
+          <w:szCs w:val="22"/>
+        </w:rPr>
+      </w:pPr>
+      <w:r>
+        <w:rPr>
+          <w:sz w:val="22"/>
+          <w:szCs w:val="22"/>
+        </w:rPr>
+        <w:t>@</w:t>
+      </w:r>
+      <w:proofErr w:type="gramStart"/>
+      <w:r>
+        <w:rPr>
+          <w:sz w:val="22"/>
+          <w:szCs w:val="22"/>
+        </w:rPr>
+        <w:t>BatchSize(</w:t>
+      </w:r>
+      <w:proofErr w:type="gramEnd"/>
+      <w:r>
+        <w:rPr>
+          <w:sz w:val="22"/>
+          <w:szCs w:val="22"/>
+        </w:rPr>
+        <w:t>size = 20)</w:t>
+      </w:r>
+    </w:p>
+    <w:p>
+      <w:pPr>
+        <w:rPr>
+          <w:sz w:val="22"/>
+          <w:szCs w:val="22"/>
+        </w:rPr>
+      </w:pPr>
+      <w:r>
+        <w:rPr>
+          <w:sz w:val="22"/>
+          <w:szCs w:val="22"/>
+        </w:rPr>
+        <w:t xml:space="preserve">private Department </w:t>
+      </w:r>
+      <w:proofErr w:type="spellStart"/>
+      <w:r>
+        <w:rPr>
+          <w:sz w:val="22"/>
+          <w:szCs w:val="22"/>
+        </w:rPr>
+        <w:t>department</w:t>
+      </w:r>
+      <w:proofErr w:type="spellEnd"/>
+      <w:r>
+        <w:rPr>
+          <w:sz w:val="22"/>
+          <w:szCs w:val="22"/>
+        </w:rPr>
+        <w:t>;</w:t>
+      </w:r>
+    </w:p>
+    <w:p>
+      <w:pPr>
+        <w:rPr>
+          <w:sz w:val="22"/>
+          <w:szCs w:val="22"/>
+        </w:rPr>
+      </w:pPr>
+      <w:r>
+        <w:rPr>
+          <w:sz w:val="22"/>
+          <w:szCs w:val="22"/>
+        </w:rPr>
+        <w:t>2) Global Configuration:</w:t>
+      </w:r>
+    </w:p>
+    <w:tbl>
+      <w:tblPr>
+        <w:tblStyle w:val="TableGrid"/>
+        <w:tblW w:w="0" w:type="auto"/>
+        <w:tblLook w:val="04A0" w:firstRow="1" w:lastRow="0" w:firstColumn="1" w:lastColumn="0" w:noHBand="0" w:noVBand="1"/>
+      </w:tblPr>
+      <w:tblGrid>
+        <w:gridCol w:w="8320"/>
+      </w:tblGrid>
+      <w:tr>
+        <w:trPr>
+          <w:trHeight w:val="258"/>
+        </w:trPr>
+        <w:tc>
+          <w:tcPr>
+            <w:tcW w:w="8320" w:type="dxa"/>
+          </w:tcPr>
+          <w:p>
+            <w:pPr>
+              <w:rPr>
+                <w:sz w:val="32"/>
+                <w:szCs w:val="32"/>
+              </w:rPr>
+            </w:pPr>
+            <w:proofErr w:type="spellStart"/>
+            <w:proofErr w:type="gramStart"/>
+            <w:r>
+              <w:rPr>
+                <w:sz w:val="32"/>
+                <w:szCs w:val="32"/>
+              </w:rPr>
+              <w:t>spring.jpa.properties</w:t>
+            </w:r>
+            <w:proofErr w:type="gramEnd"/>
+            <w:r>
+              <w:rPr>
+                <w:sz w:val="32"/>
+                <w:szCs w:val="32"/>
+              </w:rPr>
+              <w:t>.hibernate.default_</w:t>
+            </w:r>
+            <w:r>
+              <w:rPr>
+                <w:b/>
+                <w:bCs/>
+                <w:sz w:val="32"/>
+                <w:szCs w:val="32"/>
+              </w:rPr>
+              <w:t>batch_fetch_size</w:t>
+            </w:r>
+            <w:proofErr w:type="spellEnd"/>
+            <w:r>
+              <w:rPr>
+                <w:sz w:val="32"/>
+                <w:szCs w:val="32"/>
+              </w:rPr>
+              <w:t>=20</w:t>
+            </w:r>
+          </w:p>
+          <w:p>
+            <w:pPr>
+              <w:rPr>
+                <w:sz w:val="32"/>
+                <w:szCs w:val="32"/>
+              </w:rPr>
+            </w:pPr>
+          </w:p>
+        </w:tc>
+      </w:tr>
+    </w:tbl>
+    <w:p>
+      <w:pPr>
+        <w:rPr>
+          <w:sz w:val="26"/>
+          <w:szCs w:val="26"/>
+        </w:rPr>
+      </w:pPr>
+      <w:r>
+        <w:rPr>
+          <w:sz w:val="26"/>
+          <w:szCs w:val="26"/>
+        </w:rPr>
+        <w:t>Batch fetching does not fetch everything immediately it is still lazy.</w:t>
+      </w:r>
+    </w:p>
+    <w:p>
+      <w:pPr>
+        <w:rPr>
+          <w:sz w:val="26"/>
+          <w:szCs w:val="26"/>
+        </w:rPr>
+      </w:pPr>
+      <w:r>
+        <w:rPr>
+          <w:sz w:val="26"/>
+          <w:szCs w:val="26"/>
+        </w:rPr>
+        <w:t>Join Fetching:</w:t>
+      </w:r>
+      <w:r>
+        <w:rPr>
+          <w:sz w:val="26"/>
+          <w:szCs w:val="26"/>
+        </w:rPr>
+        <w:br/>
+      </w:r>
+      <w:r>
+        <w:rPr>
+          <w:sz w:val="26"/>
+          <w:szCs w:val="26"/>
+        </w:rPr>
+        <w:t>@</w:t>
+      </w:r>
+      <w:proofErr w:type="gramStart"/>
+      <w:r>
+        <w:rPr>
+          <w:sz w:val="26"/>
+          <w:szCs w:val="26"/>
+        </w:rPr>
+        <w:t>Query(</w:t>
+      </w:r>
+      <w:proofErr w:type="gramEnd"/>
+      <w:r>
+        <w:rPr>
+          <w:sz w:val="26"/>
+          <w:szCs w:val="26"/>
+        </w:rPr>
+        <w:t>"""</w:t>
+      </w:r>
+    </w:p>
+    <w:p>
+      <w:pPr>
+        <w:rPr>
+          <w:sz w:val="26"/>
+          <w:szCs w:val="26"/>
+        </w:rPr>
+      </w:pPr>
+      <w:r>
+        <w:rPr>
+          <w:sz w:val="26"/>
+          <w:szCs w:val="26"/>
+        </w:rPr>
+        <w:t>SELECT e</w:t>
+      </w:r>
+    </w:p>
+    <w:p>
+      <w:pPr>
+        <w:rPr>
+          <w:sz w:val="26"/>
+          <w:szCs w:val="26"/>
+        </w:rPr>
+      </w:pPr>
+      <w:r>
+        <w:rPr>
+          <w:sz w:val="26"/>
+          <w:szCs w:val="26"/>
+        </w:rPr>
+        <w:t>FROM Employee e</w:t>
+      </w:r>
+    </w:p>
+    <w:p>
+      <w:pPr>
+        <w:rPr>
+          <w:sz w:val="26"/>
+          <w:szCs w:val="26"/>
+        </w:rPr>
+      </w:pPr>
+      <w:r>
+        <w:rPr>
+          <w:sz w:val="26"/>
+          <w:szCs w:val="26"/>
+        </w:rPr>
+        <w:t xml:space="preserve">JOIN FETCH </w:t>
+      </w:r>
+      <w:proofErr w:type="spellStart"/>
+      <w:proofErr w:type="gramStart"/>
+      <w:r>
+        <w:rPr>
+          <w:sz w:val="26"/>
+          <w:szCs w:val="26"/>
+        </w:rPr>
+        <w:t>e.department</w:t>
+      </w:r>
+      <w:proofErr w:type="spellEnd"/>
+      <w:proofErr w:type="gramEnd"/>
+    </w:p>
+    <w:p>
+      <w:pPr>
+        <w:rPr>
+          <w:sz w:val="26"/>
+          <w:szCs w:val="26"/>
+        </w:rPr>
+      </w:pPr>
+      <w:r>
+        <w:rPr>
+          <w:sz w:val="26"/>
+          <w:szCs w:val="26"/>
+        </w:rPr>
+        <w:t>""")</w:t>
+      </w:r>
+    </w:p>
+    <w:p>
+      <w:pPr>
+        <w:rPr>
+          <w:sz w:val="26"/>
+          <w:szCs w:val="26"/>
+        </w:rPr>
+      </w:pPr>
+      <w:r>
+        <w:rPr>
+          <w:sz w:val="26"/>
+          <w:szCs w:val="26"/>
+        </w:rPr>
+        <w:t xml:space="preserve">This loads everything in </w:t>
+      </w:r>
+      <w:r>
+        <w:rPr>
+          <w:b/>
+          <w:bCs/>
+          <w:sz w:val="26"/>
+          <w:szCs w:val="26"/>
+        </w:rPr>
+        <w:t>one query</w:t>
+      </w:r>
+      <w:r>
+        <w:rPr>
+          <w:sz w:val="26"/>
+          <w:szCs w:val="26"/>
+        </w:rPr>
+        <w:t>.</w:t>
+      </w:r>
+    </w:p>
+    <w:p>
+      <w:pPr>
+        <w:rPr>
+          <w:sz w:val="26"/>
+          <w:szCs w:val="26"/>
+        </w:rPr>
+      </w:pPr>
+      <w:r>
+        <w:rPr>
+          <w:sz w:val="26"/>
+          <w:szCs w:val="26"/>
+        </w:rPr>
+        <w:t>Batch Fetching is different</w:t>
+      </w:r>
+      <w:r>
+        <w:rPr>
+          <w:sz w:val="26"/>
+          <w:szCs w:val="26"/>
+        </w:rPr>
+        <w:t>.</w:t>
+      </w:r>
+    </w:p>
+    <w:p>
+      <w:pPr>
+        <w:rPr>
+          <w:b/>
+          <w:bCs/>
+          <w:sz w:val="40"/>
+          <w:szCs w:val="40"/>
+        </w:rPr>
+      </w:pPr>
+      <w:r>
+        <w:rPr>
+          <w:b/>
+          <w:bCs/>
+          <w:sz w:val="40"/>
+          <w:szCs w:val="40"/>
+        </w:rPr>
+        <w:t>Batch Processing:</w:t>
+      </w:r>
+    </w:p>
+    <w:p>
+      <w:pPr>
+        <w:rPr>
+          <w:sz w:val="26"/>
+          <w:szCs w:val="26"/>
+        </w:rPr>
+      </w:pPr>
+      <w:r>
+        <w:rPr>
+          <w:sz w:val="26"/>
+          <w:szCs w:val="26"/>
+        </w:rPr>
+        <w:t xml:space="preserve">Process of executing a large number of records in a </w:t>
+      </w:r>
+      <w:proofErr w:type="gramStart"/>
+      <w:r>
+        <w:rPr>
+          <w:sz w:val="26"/>
+          <w:szCs w:val="26"/>
+        </w:rPr>
+        <w:t>small groups(batches)</w:t>
+      </w:r>
+      <w:proofErr w:type="gramEnd"/>
+      <w:r>
+        <w:rPr>
+          <w:sz w:val="26"/>
+          <w:szCs w:val="26"/>
+        </w:rPr>
+        <w:t xml:space="preserve"> instead of processing them one by one.</w:t>
+      </w:r>
+    </w:p>
+    <w:p>
+      <w:pPr>
+        <w:rPr>
+          <w:sz w:val="26"/>
+          <w:szCs w:val="26"/>
+        </w:rPr>
+      </w:pPr>
+      <w:r>
+        <w:rPr>
+          <w:sz w:val="26"/>
+          <w:szCs w:val="26"/>
+        </w:rPr>
+        <w:t>Why we need:</w:t>
+      </w:r>
+    </w:p>
+    <w:p>
+      <w:pPr>
+        <w:rPr>
+          <w:sz w:val="26"/>
+          <w:szCs w:val="26"/>
+        </w:rPr>
+      </w:pPr>
+      <w:proofErr w:type="gramStart"/>
+      <w:r>
+        <w:rPr>
+          <w:sz w:val="26"/>
+          <w:szCs w:val="26"/>
+        </w:rPr>
+        <w:t>Suppose  company</w:t>
+      </w:r>
+      <w:proofErr w:type="gramEnd"/>
+      <w:r>
+        <w:rPr>
+          <w:sz w:val="26"/>
+          <w:szCs w:val="26"/>
+        </w:rPr>
+        <w:t xml:space="preserve"> have to update the salary slip of 5,00,000 employees, if they are doing like:</w:t>
+      </w:r>
+    </w:p>
+    <w:p>
+      <w:pPr>
+        <w:rPr>
+          <w:sz w:val="26"/>
+          <w:szCs w:val="26"/>
+        </w:rPr>
+      </w:pPr>
+      <w:r>
+        <w:rPr>
+          <w:sz w:val="26"/>
+          <w:szCs w:val="26"/>
+        </w:rPr>
+        <w:t>Employee1 commit -&gt; employee2 commit ----------------------------------</w:t>
+      </w:r>
+      <w:proofErr w:type="spellStart"/>
+      <w:r>
+        <w:rPr>
+          <w:sz w:val="26"/>
+          <w:szCs w:val="26"/>
+        </w:rPr>
+        <w:t>employeen</w:t>
+      </w:r>
+      <w:proofErr w:type="spellEnd"/>
+      <w:r>
+        <w:rPr>
+          <w:sz w:val="26"/>
+          <w:szCs w:val="26"/>
+        </w:rPr>
+        <w:t xml:space="preserve"> n commit</w:t>
+      </w:r>
+    </w:p>
+    <w:p>
+      <w:pPr>
+        <w:rPr>
+          <w:sz w:val="26"/>
+          <w:szCs w:val="26"/>
+        </w:rPr>
+      </w:pPr>
+      <w:r>
+        <w:rPr>
+          <w:sz w:val="26"/>
+          <w:szCs w:val="26"/>
+        </w:rPr>
+        <w:t xml:space="preserve">Ther are too many </w:t>
+      </w:r>
+      <w:proofErr w:type="spellStart"/>
+      <w:r>
+        <w:rPr>
+          <w:sz w:val="26"/>
+          <w:szCs w:val="26"/>
+        </w:rPr>
+        <w:t>db</w:t>
+      </w:r>
+      <w:proofErr w:type="spellEnd"/>
+      <w:r>
+        <w:rPr>
+          <w:sz w:val="26"/>
+          <w:szCs w:val="26"/>
+        </w:rPr>
+        <w:t xml:space="preserve"> calls, too many commits, slow performance, high memory usage.</w:t>
+      </w:r>
+    </w:p>
+    <w:p>
+      <w:pPr>
+        <w:rPr>
+          <w:sz w:val="26"/>
+          <w:szCs w:val="26"/>
+        </w:rPr>
+      </w:pPr>
+      <w:r>
+        <w:rPr>
+          <w:sz w:val="26"/>
+          <w:szCs w:val="26"/>
+        </w:rPr>
+        <w:t>Instead in BP we do 100employees -&gt; save -&gt; commit -&gt; next 100 emp.</w:t>
+      </w:r>
+    </w:p>
+    <w:tbl>
+      <w:tblPr>
+        <w:tblStyle w:val="TableGrid"/>
+        <w:tblW w:w="0" w:type="auto"/>
+        <w:tblLook w:val="04A0" w:firstRow="1" w:lastRow="0" w:firstColumn="1" w:lastColumn="0" w:noHBand="0" w:noVBand="1"/>
+      </w:tblPr>
+      <w:tblGrid>
+        <w:gridCol w:w="5228"/>
+      </w:tblGrid>
+      <w:tr>
+        <w:trPr>
+          <w:trHeight w:val="807"/>
+        </w:trPr>
+        <w:tc>
+          <w:tcPr>
+            <w:tcW w:w="5228" w:type="dxa"/>
+          </w:tcPr>
+          <w:p>
+            <w:pPr>
+              <w:rPr>
+                <w:sz w:val="26"/>
+                <w:szCs w:val="26"/>
+              </w:rPr>
+            </w:pPr>
+            <w:r>
+              <w:rPr>
+                <w:sz w:val="26"/>
+                <w:szCs w:val="26"/>
+              </w:rPr>
+              <w:t>List&lt;Employee&gt; employees = ...</w:t>
+            </w:r>
+          </w:p>
+          <w:p>
+            <w:pPr>
+              <w:spacing w:after="160" w:line="278" w:lineRule="auto"/>
+              <w:rPr>
+                <w:sz w:val="26"/>
+                <w:szCs w:val="26"/>
+              </w:rPr>
+            </w:pPr>
+            <w:proofErr w:type="spellStart"/>
+            <w:r>
+              <w:rPr>
+                <w:sz w:val="26"/>
+                <w:szCs w:val="26"/>
+              </w:rPr>
+              <w:t>employeeRepository.saveAll</w:t>
+            </w:r>
+            <w:proofErr w:type="spellEnd"/>
+            <w:r>
+              <w:rPr>
+                <w:sz w:val="26"/>
+                <w:szCs w:val="26"/>
+              </w:rPr>
+              <w:t>(employees);</w:t>
+            </w:r>
+          </w:p>
+        </w:tc>
+      </w:tr>
+    </w:tbl>
+    <w:p>
+      <w:pPr>
+        <w:rPr>
+          <w:sz w:val="26"/>
+          <w:szCs w:val="26"/>
+        </w:rPr>
+      </w:pPr>
+      <w:proofErr w:type="spellStart"/>
+      <w:proofErr w:type="gramStart"/>
+      <w:r>
+        <w:rPr>
+          <w:sz w:val="26"/>
+          <w:szCs w:val="26"/>
+        </w:rPr>
+        <w:t>spring.jpa.properties</w:t>
+      </w:r>
+      <w:proofErr w:type="gramEnd"/>
+      <w:r>
+        <w:rPr>
+          <w:sz w:val="26"/>
+          <w:szCs w:val="26"/>
+        </w:rPr>
+        <w:t>.</w:t>
+      </w:r>
+      <w:proofErr w:type="gramStart"/>
+      <w:r>
+        <w:rPr>
+          <w:sz w:val="26"/>
+          <w:szCs w:val="26"/>
+        </w:rPr>
+        <w:t>hibernate.jdbc</w:t>
+      </w:r>
+      <w:proofErr w:type="gramEnd"/>
+      <w:r>
+        <w:rPr>
+          <w:sz w:val="26"/>
+          <w:szCs w:val="26"/>
+        </w:rPr>
+        <w:t>.</w:t>
+      </w:r>
+      <w:r>
+        <w:rPr>
+          <w:b/>
+          <w:bCs/>
+          <w:sz w:val="26"/>
+          <w:szCs w:val="26"/>
+        </w:rPr>
+        <w:t>batch_size</w:t>
+      </w:r>
+      <w:proofErr w:type="spellEnd"/>
+      <w:r>
+        <w:rPr>
+          <w:sz w:val="26"/>
+          <w:szCs w:val="26"/>
+        </w:rPr>
+        <w:t>=50</w:t>
+      </w:r>
+      <w:r>
+        <w:rPr>
+          <w:sz w:val="26"/>
+          <w:szCs w:val="26"/>
+        </w:rPr>
+        <w:t>// configuration.</w:t>
+      </w:r>
+    </w:p>
+    <w:p>
+      <w:pPr>
+        <w:rPr>
+          <w:sz w:val="26"/>
+          <w:szCs w:val="26"/>
+        </w:rPr>
+      </w:pPr>
+      <w:proofErr w:type="spellStart"/>
+      <w:proofErr w:type="gramStart"/>
+      <w:r>
+        <w:rPr>
+          <w:sz w:val="26"/>
+          <w:szCs w:val="26"/>
+        </w:rPr>
+        <w:t>spring.jpa.properties</w:t>
+      </w:r>
+      <w:proofErr w:type="gramEnd"/>
+      <w:r>
+        <w:rPr>
+          <w:sz w:val="26"/>
+          <w:szCs w:val="26"/>
+        </w:rPr>
+        <w:t>.</w:t>
+      </w:r>
+      <w:proofErr w:type="gramStart"/>
+      <w:r>
+        <w:rPr>
+          <w:sz w:val="26"/>
+          <w:szCs w:val="26"/>
+        </w:rPr>
+        <w:t>hibernate.order</w:t>
+      </w:r>
+      <w:proofErr w:type="gramEnd"/>
+      <w:r>
+        <w:rPr>
+          <w:sz w:val="26"/>
+          <w:szCs w:val="26"/>
+        </w:rPr>
+        <w:t>_inserts</w:t>
+      </w:r>
+      <w:proofErr w:type="spellEnd"/>
+      <w:r>
+        <w:rPr>
+          <w:sz w:val="26"/>
+          <w:szCs w:val="26"/>
+        </w:rPr>
+        <w:t>=true</w:t>
+      </w:r>
+    </w:p>
+    <w:p>
+      <w:pPr>
+        <w:rPr>
+          <w:sz w:val="26"/>
+          <w:szCs w:val="26"/>
+        </w:rPr>
+      </w:pPr>
+      <w:proofErr w:type="spellStart"/>
+      <w:proofErr w:type="gramStart"/>
+      <w:r>
+        <w:rPr>
+          <w:sz w:val="26"/>
+          <w:szCs w:val="26"/>
+        </w:rPr>
+        <w:t>spring.jpa.properties</w:t>
+      </w:r>
+      <w:proofErr w:type="gramEnd"/>
+      <w:r>
+        <w:rPr>
+          <w:sz w:val="26"/>
+          <w:szCs w:val="26"/>
+        </w:rPr>
+        <w:t>.</w:t>
+      </w:r>
+      <w:proofErr w:type="gramStart"/>
+      <w:r>
+        <w:rPr>
+          <w:sz w:val="26"/>
+          <w:szCs w:val="26"/>
+        </w:rPr>
+        <w:t>hibernate.order</w:t>
+      </w:r>
+      <w:proofErr w:type="gramEnd"/>
+      <w:r>
+        <w:rPr>
+          <w:sz w:val="26"/>
+          <w:szCs w:val="26"/>
+        </w:rPr>
+        <w:t>_updates</w:t>
+      </w:r>
+      <w:proofErr w:type="spellEnd"/>
+      <w:r>
+        <w:rPr>
+          <w:sz w:val="26"/>
+          <w:szCs w:val="26"/>
+        </w:rPr>
+        <w:t>=true</w:t>
+      </w:r>
+    </w:p>
+    <w:p>
+      <w:pPr>
+        <w:rPr>
+          <w:sz w:val="26"/>
+          <w:szCs w:val="26"/>
+        </w:rPr>
+      </w:pPr>
+      <w:r>
+        <w:rPr>
+          <w:sz w:val="26"/>
+          <w:szCs w:val="26"/>
+        </w:rPr>
+        <w:lastRenderedPageBreak/>
+        <w:t>above 2 groups similar insert and updates together fir better batching.</w:t>
+      </w:r>
+    </w:p>
+    <w:p>
+      <w:pPr>
+        <w:rPr>
+          <w:sz w:val="26"/>
+          <w:szCs w:val="26"/>
+        </w:rPr>
+      </w:pPr>
+      <w:r>
+        <w:rPr>
+          <w:sz w:val="26"/>
+          <w:szCs w:val="26"/>
+        </w:rPr>
+        <w:t xml:space="preserve">It is </w:t>
+      </w:r>
+      <w:proofErr w:type="gramStart"/>
+      <w:r>
+        <w:rPr>
+          <w:sz w:val="26"/>
+          <w:szCs w:val="26"/>
+        </w:rPr>
+        <w:t>hibernate</w:t>
+      </w:r>
+      <w:proofErr w:type="gramEnd"/>
+      <w:r>
+        <w:rPr>
+          <w:sz w:val="26"/>
+          <w:szCs w:val="26"/>
+        </w:rPr>
+        <w:t xml:space="preserve"> JDBC batching.</w:t>
+      </w:r>
+    </w:p>
+    <w:p>
+      <w:pPr>
+        <w:rPr>
+          <w:sz w:val="26"/>
+          <w:szCs w:val="26"/>
+        </w:rPr>
+      </w:pPr>
+      <w:r>
+        <w:rPr>
+          <w:sz w:val="26"/>
+          <w:szCs w:val="26"/>
+        </w:rPr>
+        <w:t>Spring Batch:</w:t>
+      </w:r>
+    </w:p>
+    <w:p>
+      <w:pPr>
+        <w:rPr>
+          <w:sz w:val="26"/>
+          <w:szCs w:val="26"/>
+        </w:rPr>
+      </w:pPr>
+      <w:r>
+        <w:rPr>
+          <w:sz w:val="26"/>
+          <w:szCs w:val="26"/>
+        </w:rPr>
+        <w:t>Spring Batch is used for:</w:t>
+      </w:r>
+    </w:p>
+    <w:p>
+      <w:pPr>
+        <w:numPr>
+          <w:ilvl w:val="0"/>
+          <w:numId w:val="19"/>
+        </w:numPr>
+        <w:rPr>
+          <w:sz w:val="26"/>
+          <w:szCs w:val="26"/>
+        </w:rPr>
+      </w:pPr>
+      <w:r>
+        <w:rPr>
+          <w:sz w:val="26"/>
+          <w:szCs w:val="26"/>
+        </w:rPr>
+        <w:t xml:space="preserve">Reading millions of records </w:t>
+      </w:r>
+    </w:p>
+    <w:p>
+      <w:pPr>
+        <w:numPr>
+          <w:ilvl w:val="0"/>
+          <w:numId w:val="19"/>
+        </w:numPr>
+        <w:rPr>
+          <w:sz w:val="26"/>
+          <w:szCs w:val="26"/>
+        </w:rPr>
+      </w:pPr>
+      <w:r>
+        <w:rPr>
+          <w:sz w:val="26"/>
+          <w:szCs w:val="26"/>
+        </w:rPr>
+        <w:t xml:space="preserve">Processing them </w:t>
+      </w:r>
+    </w:p>
+    <w:p>
+      <w:pPr>
+        <w:numPr>
+          <w:ilvl w:val="0"/>
+          <w:numId w:val="19"/>
+        </w:numPr>
+        <w:rPr>
+          <w:sz w:val="26"/>
+          <w:szCs w:val="26"/>
+        </w:rPr>
+      </w:pPr>
+      <w:r>
+        <w:rPr>
+          <w:sz w:val="26"/>
+          <w:szCs w:val="26"/>
+        </w:rPr>
+        <w:t xml:space="preserve">Writing them back </w:t>
+      </w:r>
+    </w:p>
+    <w:p>
+      <w:pPr>
+        <w:numPr>
+          <w:ilvl w:val="0"/>
+          <w:numId w:val="19"/>
+        </w:numPr>
+        <w:rPr>
+          <w:sz w:val="26"/>
+          <w:szCs w:val="26"/>
+        </w:rPr>
+      </w:pPr>
+      <w:r>
+        <w:rPr>
+          <w:sz w:val="26"/>
+          <w:szCs w:val="26"/>
+        </w:rPr>
+        <w:t xml:space="preserve">Restarting failed jobs </w:t>
+      </w:r>
+    </w:p>
+    <w:p>
+      <w:pPr>
+        <w:numPr>
+          <w:ilvl w:val="0"/>
+          <w:numId w:val="19"/>
+        </w:numPr>
+        <w:rPr>
+          <w:sz w:val="26"/>
+          <w:szCs w:val="26"/>
+        </w:rPr>
+      </w:pPr>
+      <w:r>
+        <w:rPr>
+          <w:sz w:val="26"/>
+          <w:szCs w:val="26"/>
+        </w:rPr>
+        <w:t xml:space="preserve">Scheduling batch jobs </w:t>
+      </w:r>
+    </w:p>
+    <w:p>
+      <w:pPr>
+        <w:rPr>
+          <w:sz w:val="26"/>
+          <w:szCs w:val="26"/>
+        </w:rPr>
+      </w:pPr>
+      <w:r>
+        <w:rPr>
+          <w:sz w:val="26"/>
+          <w:szCs w:val="26"/>
+        </w:rPr>
+        <w:t>Spring Batch is an enterprise framework and much larger than Hibernate batching.</w:t>
+      </w:r>
+    </w:p>
+    <w:p>
+      <w:pPr>
+        <w:rPr>
+          <w:b/>
+          <w:bCs/>
+          <w:sz w:val="38"/>
+          <w:szCs w:val="38"/>
+        </w:rPr>
+      </w:pPr>
+      <w:r>
+        <w:rPr>
+          <w:b/>
+          <w:bCs/>
+          <w:sz w:val="38"/>
+          <w:szCs w:val="38"/>
+        </w:rPr>
+        <w:t>Entity Graph:</w:t>
+      </w:r>
     </w:p>
     <w:p>
       <w:pPr>
         <w:ind w:left="360"/>
       </w:pPr>
-    </w:p>
+      <w:r>
+        <w:t>Entity Graph is a JPA feature that allows us to specify which lazy associations should be fetched eagerly for a particular query. It helps avoid the N+1 query problem without changing the default fetch type of the entity.</w:t>
+      </w:r>
+    </w:p>
+    <w:tbl>
+      <w:tblPr>
+        <w:tblStyle w:val="TableGrid"/>
+        <w:tblW w:w="0" w:type="auto"/>
+        <w:tblInd w:w="360" w:type="dxa"/>
+        <w:tblLook w:val="04A0" w:firstRow="1" w:lastRow="0" w:firstColumn="1" w:lastColumn="0" w:noHBand="0" w:noVBand="1"/>
+      </w:tblPr>
+      <w:tblGrid>
+        <w:gridCol w:w="5311"/>
+      </w:tblGrid>
+      <w:tr>
+        <w:trPr>
+          <w:trHeight w:val="951"/>
+        </w:trPr>
+        <w:tc>
+          <w:tcPr>
+            <w:tcW w:w="5311" w:type="dxa"/>
+          </w:tcPr>
+          <w:p>
+            <w:pPr>
+              <w:spacing w:after="160" w:line="278" w:lineRule="auto"/>
+              <w:ind w:left="360"/>
+            </w:pPr>
+            <w:r>
+              <w:t>@</w:t>
+            </w:r>
+            <w:proofErr w:type="gramStart"/>
+            <w:r>
+              <w:t>EntityGraph(</w:t>
+            </w:r>
+            <w:proofErr w:type="gramEnd"/>
+            <w:r>
+              <w:t>attributePaths = {"department"})</w:t>
+            </w:r>
+          </w:p>
+          <w:p>
+            <w:pPr>
+              <w:spacing w:after="160" w:line="278" w:lineRule="auto"/>
+              <w:ind w:left="360"/>
+            </w:pPr>
+            <w:r>
+              <w:t xml:space="preserve">List&lt;Employee&gt; </w:t>
+            </w:r>
+            <w:proofErr w:type="spellStart"/>
+            <w:proofErr w:type="gramStart"/>
+            <w:r>
+              <w:t>findByCity</w:t>
+            </w:r>
+            <w:proofErr w:type="spellEnd"/>
+            <w:r>
+              <w:t>(</w:t>
+            </w:r>
+            <w:proofErr w:type="gramEnd"/>
+            <w:r>
+              <w:t>String city);</w:t>
+            </w:r>
+          </w:p>
+        </w:tc>
+      </w:tr>
+    </w:tbl>
+    <w:p>
+      <w:pPr>
+        <w:ind w:left="360"/>
+      </w:pPr>
+      <w:r>
+        <w:t>Only for this method fetch type become EAGER.</w:t>
+      </w:r>
+    </w:p>
+    <w:p>
+      <w:pPr>
+        <w:rPr>
+          <w:sz w:val="36"/>
+          <w:szCs w:val="36"/>
+        </w:rPr>
+      </w:pPr>
+      <w:proofErr w:type="spellStart"/>
+      <w:r>
+        <w:rPr>
+          <w:b/>
+          <w:bCs/>
+          <w:sz w:val="36"/>
+          <w:szCs w:val="36"/>
+        </w:rPr>
+        <w:t>LazyInitializationException</w:t>
+      </w:r>
+      <w:proofErr w:type="spellEnd"/>
+      <w:r>
+        <w:rPr>
+          <w:b/>
+          <w:bCs/>
+          <w:sz w:val="36"/>
+          <w:szCs w:val="36"/>
+        </w:rPr>
+        <w:t>:</w:t>
+      </w:r>
+    </w:p>
+    <w:p>
+      <w:pPr>
+        <w:rPr>
+          <w:sz w:val="20"/>
+          <w:szCs w:val="20"/>
+        </w:rPr>
+      </w:pPr>
+      <w:r>
+        <w:rPr>
+          <w:sz w:val="20"/>
+          <w:szCs w:val="20"/>
+        </w:rPr>
+        <w:t>It occurs when a LAZY-loaded association is accessed after the Persistence Context (Hibernate Session) has already been closed.</w:t>
+      </w:r>
+    </w:p>
+    <w:p>
+      <w:pPr>
+        <w:rPr>
+          <w:b/>
+          <w:bCs/>
+          <w:sz w:val="20"/>
+          <w:szCs w:val="20"/>
+        </w:rPr>
+      </w:pPr>
+      <w:r>
+        <w:rPr>
+          <w:b/>
+          <w:bCs/>
+          <w:sz w:val="20"/>
+          <w:szCs w:val="20"/>
+        </w:rPr>
+        <w:t>How can we solve it?</w:t>
+      </w:r>
+    </w:p>
+    <w:p>
+      <w:pPr>
+        <w:numPr>
+          <w:ilvl w:val="0"/>
+          <w:numId w:val="20"/>
+        </w:numPr>
+        <w:rPr>
+          <w:sz w:val="20"/>
+          <w:szCs w:val="20"/>
+        </w:rPr>
+      </w:pPr>
+      <w:r>
+        <w:rPr>
+          <w:sz w:val="20"/>
+          <w:szCs w:val="20"/>
+        </w:rPr>
+        <w:t xml:space="preserve">@Transactional </w:t>
+      </w:r>
+    </w:p>
+    <w:p>
+      <w:pPr>
+        <w:numPr>
+          <w:ilvl w:val="0"/>
+          <w:numId w:val="20"/>
+        </w:numPr>
+        <w:rPr>
+          <w:sz w:val="20"/>
+          <w:szCs w:val="20"/>
+        </w:rPr>
+      </w:pPr>
+      <w:r>
+        <w:rPr>
+          <w:sz w:val="20"/>
+          <w:szCs w:val="20"/>
+        </w:rPr>
+        <w:t xml:space="preserve">@EntityGraph </w:t>
+      </w:r>
+    </w:p>
+    <w:p>
+      <w:pPr>
+        <w:numPr>
+          <w:ilvl w:val="0"/>
+          <w:numId w:val="20"/>
+        </w:numPr>
+        <w:rPr>
+          <w:sz w:val="20"/>
+          <w:szCs w:val="20"/>
+        </w:rPr>
+      </w:pPr>
+      <w:r>
+        <w:rPr>
+          <w:sz w:val="20"/>
+          <w:szCs w:val="20"/>
+        </w:rPr>
+        <w:t xml:space="preserve">JOIN FETCH </w:t>
+      </w:r>
+    </w:p>
+    <w:p>
+      <w:pPr>
+        <w:numPr>
+          <w:ilvl w:val="0"/>
+          <w:numId w:val="20"/>
+        </w:numPr>
+        <w:rPr>
+          <w:sz w:val="20"/>
+          <w:szCs w:val="20"/>
+        </w:rPr>
+      </w:pPr>
+      <w:r>
+        <w:rPr>
+          <w:sz w:val="20"/>
+          <w:szCs w:val="20"/>
+        </w:rPr>
+        <w:t xml:space="preserve">DTO Projection </w:t>
+      </w:r>
+    </w:p>
+    <w:p>
+      <w:pPr>
+        <w:rPr>
+          <w:sz w:val="20"/>
+          <w:szCs w:val="20"/>
+        </w:rPr>
+      </w:pPr>
+    </w:p>
+    <w:p>
+      <w:pPr>
+        <w:rPr>
+          <w:noProof/>
+          <w:lang w:val="en-IN"/>
+        </w:rPr>
+      </w:pPr>
+      <w:r>
+        <w:rPr>
+          <w:b/>
+          <w:bCs/>
+          <w:noProof/>
+          <w:lang w:val="en-IN"/>
+        </w:rPr>
+        <w:t>WEBHOOKS:</w:t>
+      </w:r>
+      <w:r>
+        <w:rPr>
+          <w:noProof/>
+          <w:lang w:val="en-IN"/>
+        </w:rPr>
+        <w:br/>
+        <w:t xml:space="preserve">Webhooks are automated messages sent from apps when something happens. They have payload(message) and are sent to unique URL(webhook url) defined by user </w:t>
+      </w:r>
+    </w:p>
+    <w:p>
+      <w:pPr>
+        <w:rPr>
+          <w:noProof/>
+          <w:lang w:val="en-IN"/>
+        </w:rPr>
+      </w:pPr>
+      <w:r>
+        <w:rPr>
+          <w:noProof/>
+          <w:lang w:val="en-IN"/>
+        </w:rPr>
+        <w:t xml:space="preserve">Usage: Commonly used to send real time data to other application. </w:t>
+      </w:r>
+    </w:p>
+    <w:p>
+      <w:pPr>
+        <w:rPr>
+          <w:noProof/>
+          <w:lang w:val="en-IN"/>
+        </w:rPr>
+      </w:pPr>
+      <w:r>
+        <w:rPr>
+          <w:noProof/>
+          <w:lang w:val="en-IN"/>
+        </w:rPr>
+        <w:t xml:space="preserve">Example: Github sends the webhooks when the code is pushed and payment gateway sends webhook when the payment is succesfull </w:t>
+      </w:r>
+    </w:p>
+    <w:p>
+      <w:pPr>
+        <w:rPr>
+          <w:b/>
+          <w:bCs/>
+          <w:sz w:val="22"/>
+          <w:szCs w:val="22"/>
+          <w:lang w:val="en-IN"/>
+        </w:rPr>
+      </w:pPr>
+    </w:p>
+    <w:p>
+      <w:pPr>
+        <w:rPr>
+          <w:b/>
+          <w:bCs/>
+          <w:sz w:val="22"/>
+          <w:szCs w:val="22"/>
+        </w:rPr>
+      </w:pPr>
+    </w:p>
+    <w:p>
+      <w:pPr>
+        <w:rPr>
+          <w:b/>
+          <w:bCs/>
+          <w:sz w:val="22"/>
+          <w:szCs w:val="22"/>
+        </w:rPr>
+      </w:pPr>
+    </w:p>
+    <w:p>
+      <w:pPr>
+        <w:rPr>
+          <w:b/>
+          <w:bCs/>
+          <w:sz w:val="22"/>
+          <w:szCs w:val="22"/>
+        </w:rPr>
+      </w:pPr>
+    </w:p>
+    <w:p>
+      <w:pPr>
+        <w:rPr>
+          <w:b/>
+          <w:bCs/>
+          <w:sz w:val="22"/>
+          <w:szCs w:val="22"/>
+        </w:rPr>
+      </w:pPr>
+    </w:p>
+    <w:p>
+      <w:pPr>
+        <w:rPr>
+          <w:b/>
+          <w:bCs/>
+          <w:sz w:val="22"/>
+          <w:szCs w:val="22"/>
+        </w:rPr>
+      </w:pPr>
+    </w:p>
+    <w:p/>
     <w:p>
       <w:r>
         <w:t>Important:</w:t>
@@ -25159,95 +26758,9 @@
     </w:lvl>
   </w:abstractNum>
   <w:abstractNum w:abstractNumId="3" w15:restartNumberingAfterBreak="0">
-    <w:nsid w:val="1DCA747F"/>
-    <w:multiLevelType w:val="hybridMultilevel"/>
-    <w:tmpl w:val="EA10302C"/>
-    <w:lvl w:ilvl="0" w:tplc="0409000F">
-      <w:start w:val="1"/>
-      <w:numFmt w:val="decimal"/>
-      <w:lvlText w:val="%1."/>
-      <w:lvlJc w:val="left"/>
-      <w:pPr>
-        <w:ind w:left="720" w:hanging="360"/>
-      </w:pPr>
-    </w:lvl>
-    <w:lvl w:ilvl="1" w:tplc="04090019" w:tentative="1">
-      <w:start w:val="1"/>
-      <w:numFmt w:val="lowerLetter"/>
-      <w:lvlText w:val="%2."/>
-      <w:lvlJc w:val="left"/>
-      <w:pPr>
-        <w:ind w:left="1440" w:hanging="360"/>
-      </w:pPr>
-    </w:lvl>
-    <w:lvl w:ilvl="2" w:tplc="0409001B" w:tentative="1">
-      <w:start w:val="1"/>
-      <w:numFmt w:val="lowerRoman"/>
-      <w:lvlText w:val="%3."/>
-      <w:lvlJc w:val="right"/>
-      <w:pPr>
-        <w:ind w:left="2160" w:hanging="180"/>
-      </w:pPr>
-    </w:lvl>
-    <w:lvl w:ilvl="3" w:tplc="0409000F" w:tentative="1">
-      <w:start w:val="1"/>
-      <w:numFmt w:val="decimal"/>
-      <w:lvlText w:val="%4."/>
-      <w:lvlJc w:val="left"/>
-      <w:pPr>
-        <w:ind w:left="2880" w:hanging="360"/>
-      </w:pPr>
-    </w:lvl>
-    <w:lvl w:ilvl="4" w:tplc="04090019" w:tentative="1">
-      <w:start w:val="1"/>
-      <w:numFmt w:val="lowerLetter"/>
-      <w:lvlText w:val="%5."/>
-      <w:lvlJc w:val="left"/>
-      <w:pPr>
-        <w:ind w:left="3600" w:hanging="360"/>
-      </w:pPr>
-    </w:lvl>
-    <w:lvl w:ilvl="5" w:tplc="0409001B" w:tentative="1">
-      <w:start w:val="1"/>
-      <w:numFmt w:val="lowerRoman"/>
-      <w:lvlText w:val="%6."/>
-      <w:lvlJc w:val="right"/>
-      <w:pPr>
-        <w:ind w:left="4320" w:hanging="180"/>
-      </w:pPr>
-    </w:lvl>
-    <w:lvl w:ilvl="6" w:tplc="0409000F" w:tentative="1">
-      <w:start w:val="1"/>
-      <w:numFmt w:val="decimal"/>
-      <w:lvlText w:val="%7."/>
-      <w:lvlJc w:val="left"/>
-      <w:pPr>
-        <w:ind w:left="5040" w:hanging="360"/>
-      </w:pPr>
-    </w:lvl>
-    <w:lvl w:ilvl="7" w:tplc="04090019" w:tentative="1">
-      <w:start w:val="1"/>
-      <w:numFmt w:val="lowerLetter"/>
-      <w:lvlText w:val="%8."/>
-      <w:lvlJc w:val="left"/>
-      <w:pPr>
-        <w:ind w:left="5760" w:hanging="360"/>
-      </w:pPr>
-    </w:lvl>
-    <w:lvl w:ilvl="8" w:tplc="0409001B" w:tentative="1">
-      <w:start w:val="1"/>
-      <w:numFmt w:val="lowerRoman"/>
-      <w:lvlText w:val="%9."/>
-      <w:lvlJc w:val="right"/>
-      <w:pPr>
-        <w:ind w:left="6480" w:hanging="180"/>
-      </w:pPr>
-    </w:lvl>
-  </w:abstractNum>
-  <w:abstractNum w:abstractNumId="4" w15:restartNumberingAfterBreak="0">
-    <w:nsid w:val="280C0448"/>
+    <w:nsid w:val="1B967CA5"/>
     <w:multiLevelType w:val="multilevel"/>
-    <w:tmpl w:val="E8E2D0C4"/>
+    <w:tmpl w:val="530C8AF6"/>
     <w:lvl w:ilvl="0">
       <w:start w:val="1"/>
       <w:numFmt w:val="bullet"/>
@@ -25393,7 +26906,242 @@
       </w:rPr>
     </w:lvl>
   </w:abstractNum>
+  <w:abstractNum w:abstractNumId="4" w15:restartNumberingAfterBreak="0">
+    <w:nsid w:val="1DCA747F"/>
+    <w:multiLevelType w:val="hybridMultilevel"/>
+    <w:tmpl w:val="EA10302C"/>
+    <w:lvl w:ilvl="0" w:tplc="0409000F">
+      <w:start w:val="1"/>
+      <w:numFmt w:val="decimal"/>
+      <w:lvlText w:val="%1."/>
+      <w:lvlJc w:val="left"/>
+      <w:pPr>
+        <w:ind w:left="720" w:hanging="360"/>
+      </w:pPr>
+    </w:lvl>
+    <w:lvl w:ilvl="1" w:tplc="04090019" w:tentative="1">
+      <w:start w:val="1"/>
+      <w:numFmt w:val="lowerLetter"/>
+      <w:lvlText w:val="%2."/>
+      <w:lvlJc w:val="left"/>
+      <w:pPr>
+        <w:ind w:left="1440" w:hanging="360"/>
+      </w:pPr>
+    </w:lvl>
+    <w:lvl w:ilvl="2" w:tplc="0409001B" w:tentative="1">
+      <w:start w:val="1"/>
+      <w:numFmt w:val="lowerRoman"/>
+      <w:lvlText w:val="%3."/>
+      <w:lvlJc w:val="right"/>
+      <w:pPr>
+        <w:ind w:left="2160" w:hanging="180"/>
+      </w:pPr>
+    </w:lvl>
+    <w:lvl w:ilvl="3" w:tplc="0409000F" w:tentative="1">
+      <w:start w:val="1"/>
+      <w:numFmt w:val="decimal"/>
+      <w:lvlText w:val="%4."/>
+      <w:lvlJc w:val="left"/>
+      <w:pPr>
+        <w:ind w:left="2880" w:hanging="360"/>
+      </w:pPr>
+    </w:lvl>
+    <w:lvl w:ilvl="4" w:tplc="04090019" w:tentative="1">
+      <w:start w:val="1"/>
+      <w:numFmt w:val="lowerLetter"/>
+      <w:lvlText w:val="%5."/>
+      <w:lvlJc w:val="left"/>
+      <w:pPr>
+        <w:ind w:left="3600" w:hanging="360"/>
+      </w:pPr>
+    </w:lvl>
+    <w:lvl w:ilvl="5" w:tplc="0409001B" w:tentative="1">
+      <w:start w:val="1"/>
+      <w:numFmt w:val="lowerRoman"/>
+      <w:lvlText w:val="%6."/>
+      <w:lvlJc w:val="right"/>
+      <w:pPr>
+        <w:ind w:left="4320" w:hanging="180"/>
+      </w:pPr>
+    </w:lvl>
+    <w:lvl w:ilvl="6" w:tplc="0409000F" w:tentative="1">
+      <w:start w:val="1"/>
+      <w:numFmt w:val="decimal"/>
+      <w:lvlText w:val="%7."/>
+      <w:lvlJc w:val="left"/>
+      <w:pPr>
+        <w:ind w:left="5040" w:hanging="360"/>
+      </w:pPr>
+    </w:lvl>
+    <w:lvl w:ilvl="7" w:tplc="04090019" w:tentative="1">
+      <w:start w:val="1"/>
+      <w:numFmt w:val="lowerLetter"/>
+      <w:lvlText w:val="%8."/>
+      <w:lvlJc w:val="left"/>
+      <w:pPr>
+        <w:ind w:left="5760" w:hanging="360"/>
+      </w:pPr>
+    </w:lvl>
+    <w:lvl w:ilvl="8" w:tplc="0409001B" w:tentative="1">
+      <w:start w:val="1"/>
+      <w:numFmt w:val="lowerRoman"/>
+      <w:lvlText w:val="%9."/>
+      <w:lvlJc w:val="right"/>
+      <w:pPr>
+        <w:ind w:left="6480" w:hanging="180"/>
+      </w:pPr>
+    </w:lvl>
+  </w:abstractNum>
   <w:abstractNum w:abstractNumId="5" w15:restartNumberingAfterBreak="0">
+    <w:nsid w:val="280C0448"/>
+    <w:multiLevelType w:val="multilevel"/>
+    <w:tmpl w:val="E8E2D0C4"/>
+    <w:lvl w:ilvl="0">
+      <w:start w:val="1"/>
+      <w:numFmt w:val="bullet"/>
+      <w:lvlText w:val=""/>
+      <w:lvlJc w:val="left"/>
+      <w:pPr>
+        <w:tabs>
+          <w:tab w:val="num" w:pos="720"/>
+        </w:tabs>
+        <w:ind w:left="720" w:hanging="360"/>
+      </w:pPr>
+      <w:rPr>
+        <w:rFonts w:ascii="Symbol" w:hAnsi="Symbol" w:hint="default"/>
+        <w:sz w:val="20"/>
+      </w:rPr>
+    </w:lvl>
+    <w:lvl w:ilvl="1" w:tentative="1">
+      <w:start w:val="1"/>
+      <w:numFmt w:val="bullet"/>
+      <w:lvlText w:val="o"/>
+      <w:lvlJc w:val="left"/>
+      <w:pPr>
+        <w:tabs>
+          <w:tab w:val="num" w:pos="1440"/>
+        </w:tabs>
+        <w:ind w:left="1440" w:hanging="360"/>
+      </w:pPr>
+      <w:rPr>
+        <w:rFonts w:ascii="Courier New" w:hAnsi="Courier New" w:hint="default"/>
+        <w:sz w:val="20"/>
+      </w:rPr>
+    </w:lvl>
+    <w:lvl w:ilvl="2" w:tentative="1">
+      <w:start w:val="1"/>
+      <w:numFmt w:val="bullet"/>
+      <w:lvlText w:val=""/>
+      <w:lvlJc w:val="left"/>
+      <w:pPr>
+        <w:tabs>
+          <w:tab w:val="num" w:pos="2160"/>
+        </w:tabs>
+        <w:ind w:left="2160" w:hanging="360"/>
+      </w:pPr>
+      <w:rPr>
+        <w:rFonts w:ascii="Wingdings" w:hAnsi="Wingdings" w:hint="default"/>
+        <w:sz w:val="20"/>
+      </w:rPr>
+    </w:lvl>
+    <w:lvl w:ilvl="3" w:tentative="1">
+      <w:start w:val="1"/>
+      <w:numFmt w:val="bullet"/>
+      <w:lvlText w:val=""/>
+      <w:lvlJc w:val="left"/>
+      <w:pPr>
+        <w:tabs>
+          <w:tab w:val="num" w:pos="2880"/>
+        </w:tabs>
+        <w:ind w:left="2880" w:hanging="360"/>
+      </w:pPr>
+      <w:rPr>
+        <w:rFonts w:ascii="Wingdings" w:hAnsi="Wingdings" w:hint="default"/>
+        <w:sz w:val="20"/>
+      </w:rPr>
+    </w:lvl>
+    <w:lvl w:ilvl="4" w:tentative="1">
+      <w:start w:val="1"/>
+      <w:numFmt w:val="bullet"/>
+      <w:lvlText w:val=""/>
+      <w:lvlJc w:val="left"/>
+      <w:pPr>
+        <w:tabs>
+          <w:tab w:val="num" w:pos="3600"/>
+        </w:tabs>
+        <w:ind w:left="3600" w:hanging="360"/>
+      </w:pPr>
+      <w:rPr>
+        <w:rFonts w:ascii="Wingdings" w:hAnsi="Wingdings" w:hint="default"/>
+        <w:sz w:val="20"/>
+      </w:rPr>
+    </w:lvl>
+    <w:lvl w:ilvl="5" w:tentative="1">
+      <w:start w:val="1"/>
+      <w:numFmt w:val="bullet"/>
+      <w:lvlText w:val=""/>
+      <w:lvlJc w:val="left"/>
+      <w:pPr>
+        <w:tabs>
+          <w:tab w:val="num" w:pos="4320"/>
+        </w:tabs>
+        <w:ind w:left="4320" w:hanging="360"/>
+      </w:pPr>
+      <w:rPr>
+        <w:rFonts w:ascii="Wingdings" w:hAnsi="Wingdings" w:hint="default"/>
+        <w:sz w:val="20"/>
+      </w:rPr>
+    </w:lvl>
+    <w:lvl w:ilvl="6" w:tentative="1">
+      <w:start w:val="1"/>
+      <w:numFmt w:val="bullet"/>
+      <w:lvlText w:val=""/>
+      <w:lvlJc w:val="left"/>
+      <w:pPr>
+        <w:tabs>
+          <w:tab w:val="num" w:pos="5040"/>
+        </w:tabs>
+        <w:ind w:left="5040" w:hanging="360"/>
+      </w:pPr>
+      <w:rPr>
+        <w:rFonts w:ascii="Wingdings" w:hAnsi="Wingdings" w:hint="default"/>
+        <w:sz w:val="20"/>
+      </w:rPr>
+    </w:lvl>
+    <w:lvl w:ilvl="7" w:tentative="1">
+      <w:start w:val="1"/>
+      <w:numFmt w:val="bullet"/>
+      <w:lvlText w:val=""/>
+      <w:lvlJc w:val="left"/>
+      <w:pPr>
+        <w:tabs>
+          <w:tab w:val="num" w:pos="5760"/>
+        </w:tabs>
+        <w:ind w:left="5760" w:hanging="360"/>
+      </w:pPr>
+      <w:rPr>
+        <w:rFonts w:ascii="Wingdings" w:hAnsi="Wingdings" w:hint="default"/>
+        <w:sz w:val="20"/>
+      </w:rPr>
+    </w:lvl>
+    <w:lvl w:ilvl="8" w:tentative="1">
+      <w:start w:val="1"/>
+      <w:numFmt w:val="bullet"/>
+      <w:lvlText w:val=""/>
+      <w:lvlJc w:val="left"/>
+      <w:pPr>
+        <w:tabs>
+          <w:tab w:val="num" w:pos="6480"/>
+        </w:tabs>
+        <w:ind w:left="6480" w:hanging="360"/>
+      </w:pPr>
+      <w:rPr>
+        <w:rFonts w:ascii="Wingdings" w:hAnsi="Wingdings" w:hint="default"/>
+        <w:sz w:val="20"/>
+      </w:rPr>
+    </w:lvl>
+  </w:abstractNum>
+  <w:abstractNum w:abstractNumId="6" w15:restartNumberingAfterBreak="0">
     <w:nsid w:val="29891C39"/>
     <w:multiLevelType w:val="hybridMultilevel"/>
     <w:tmpl w:val="6A803C40"/>
@@ -25483,7 +27231,7 @@
       </w:pPr>
     </w:lvl>
   </w:abstractNum>
-  <w:abstractNum w:abstractNumId="6" w15:restartNumberingAfterBreak="0">
+  <w:abstractNum w:abstractNumId="7" w15:restartNumberingAfterBreak="0">
     <w:nsid w:val="31BE7294"/>
     <w:multiLevelType w:val="hybridMultilevel"/>
     <w:tmpl w:val="F2B814D6"/>
@@ -25572,7 +27320,156 @@
       </w:pPr>
     </w:lvl>
   </w:abstractNum>
-  <w:abstractNum w:abstractNumId="7" w15:restartNumberingAfterBreak="0">
+  <w:abstractNum w:abstractNumId="8" w15:restartNumberingAfterBreak="0">
+    <w:nsid w:val="458E08AD"/>
+    <w:multiLevelType w:val="multilevel"/>
+    <w:tmpl w:val="0F2EC45C"/>
+    <w:lvl w:ilvl="0">
+      <w:start w:val="1"/>
+      <w:numFmt w:val="bullet"/>
+      <w:lvlText w:val=""/>
+      <w:lvlJc w:val="left"/>
+      <w:pPr>
+        <w:tabs>
+          <w:tab w:val="num" w:pos="720"/>
+        </w:tabs>
+        <w:ind w:left="720" w:hanging="360"/>
+      </w:pPr>
+      <w:rPr>
+        <w:rFonts w:ascii="Symbol" w:hAnsi="Symbol" w:hint="default"/>
+        <w:sz w:val="20"/>
+      </w:rPr>
+    </w:lvl>
+    <w:lvl w:ilvl="1" w:tentative="1">
+      <w:start w:val="1"/>
+      <w:numFmt w:val="bullet"/>
+      <w:lvlText w:val="o"/>
+      <w:lvlJc w:val="left"/>
+      <w:pPr>
+        <w:tabs>
+          <w:tab w:val="num" w:pos="1440"/>
+        </w:tabs>
+        <w:ind w:left="1440" w:hanging="360"/>
+      </w:pPr>
+      <w:rPr>
+        <w:rFonts w:ascii="Courier New" w:hAnsi="Courier New" w:hint="default"/>
+        <w:sz w:val="20"/>
+      </w:rPr>
+    </w:lvl>
+    <w:lvl w:ilvl="2" w:tentative="1">
+      <w:start w:val="1"/>
+      <w:numFmt w:val="bullet"/>
+      <w:lvlText w:val=""/>
+      <w:lvlJc w:val="left"/>
+      <w:pPr>
+        <w:tabs>
+          <w:tab w:val="num" w:pos="2160"/>
+        </w:tabs>
+        <w:ind w:left="2160" w:hanging="360"/>
+      </w:pPr>
+      <w:rPr>
+        <w:rFonts w:ascii="Wingdings" w:hAnsi="Wingdings" w:hint="default"/>
+        <w:sz w:val="20"/>
+      </w:rPr>
+    </w:lvl>
+    <w:lvl w:ilvl="3" w:tentative="1">
+      <w:start w:val="1"/>
+      <w:numFmt w:val="bullet"/>
+      <w:lvlText w:val=""/>
+      <w:lvlJc w:val="left"/>
+      <w:pPr>
+        <w:tabs>
+          <w:tab w:val="num" w:pos="2880"/>
+        </w:tabs>
+        <w:ind w:left="2880" w:hanging="360"/>
+      </w:pPr>
+      <w:rPr>
+        <w:rFonts w:ascii="Wingdings" w:hAnsi="Wingdings" w:hint="default"/>
+        <w:sz w:val="20"/>
+      </w:rPr>
+    </w:lvl>
+    <w:lvl w:ilvl="4" w:tentative="1">
+      <w:start w:val="1"/>
+      <w:numFmt w:val="bullet"/>
+      <w:lvlText w:val=""/>
+      <w:lvlJc w:val="left"/>
+      <w:pPr>
+        <w:tabs>
+          <w:tab w:val="num" w:pos="3600"/>
+        </w:tabs>
+        <w:ind w:left="3600" w:hanging="360"/>
+      </w:pPr>
+      <w:rPr>
+        <w:rFonts w:ascii="Wingdings" w:hAnsi="Wingdings" w:hint="default"/>
+        <w:sz w:val="20"/>
+      </w:rPr>
+    </w:lvl>
+    <w:lvl w:ilvl="5" w:tentative="1">
+      <w:start w:val="1"/>
+      <w:numFmt w:val="bullet"/>
+      <w:lvlText w:val=""/>
+      <w:lvlJc w:val="left"/>
+      <w:pPr>
+        <w:tabs>
+          <w:tab w:val="num" w:pos="4320"/>
+        </w:tabs>
+        <w:ind w:left="4320" w:hanging="360"/>
+      </w:pPr>
+      <w:rPr>
+        <w:rFonts w:ascii="Wingdings" w:hAnsi="Wingdings" w:hint="default"/>
+        <w:sz w:val="20"/>
+      </w:rPr>
+    </w:lvl>
+    <w:lvl w:ilvl="6" w:tentative="1">
+      <w:start w:val="1"/>
+      <w:numFmt w:val="bullet"/>
+      <w:lvlText w:val=""/>
+      <w:lvlJc w:val="left"/>
+      <w:pPr>
+        <w:tabs>
+          <w:tab w:val="num" w:pos="5040"/>
+        </w:tabs>
+        <w:ind w:left="5040" w:hanging="360"/>
+      </w:pPr>
+      <w:rPr>
+        <w:rFonts w:ascii="Wingdings" w:hAnsi="Wingdings" w:hint="default"/>
+        <w:sz w:val="20"/>
+      </w:rPr>
+    </w:lvl>
+    <w:lvl w:ilvl="7" w:tentative="1">
+      <w:start w:val="1"/>
+      <w:numFmt w:val="bullet"/>
+      <w:lvlText w:val=""/>
+      <w:lvlJc w:val="left"/>
+      <w:pPr>
+        <w:tabs>
+          <w:tab w:val="num" w:pos="5760"/>
+        </w:tabs>
+        <w:ind w:left="5760" w:hanging="360"/>
+      </w:pPr>
+      <w:rPr>
+        <w:rFonts w:ascii="Wingdings" w:hAnsi="Wingdings" w:hint="default"/>
+        <w:sz w:val="20"/>
+      </w:rPr>
+    </w:lvl>
+    <w:lvl w:ilvl="8" w:tentative="1">
+      <w:start w:val="1"/>
+      <w:numFmt w:val="bullet"/>
+      <w:lvlText w:val=""/>
+      <w:lvlJc w:val="left"/>
+      <w:pPr>
+        <w:tabs>
+          <w:tab w:val="num" w:pos="6480"/>
+        </w:tabs>
+        <w:ind w:left="6480" w:hanging="360"/>
+      </w:pPr>
+      <w:rPr>
+        <w:rFonts w:ascii="Wingdings" w:hAnsi="Wingdings" w:hint="default"/>
+        <w:sz w:val="20"/>
+      </w:rPr>
+    </w:lvl>
+  </w:abstractNum>
+  <w:abstractNum w:abstractNumId="9" w15:restartNumberingAfterBreak="0">
     <w:nsid w:val="4B53050F"/>
     <w:multiLevelType w:val="hybridMultilevel"/>
     <w:tmpl w:val="F4DC3C28"/>
@@ -25662,7 +27559,7 @@
       </w:pPr>
     </w:lvl>
   </w:abstractNum>
-  <w:abstractNum w:abstractNumId="8" w15:restartNumberingAfterBreak="0">
+  <w:abstractNum w:abstractNumId="10" w15:restartNumberingAfterBreak="0">
     <w:nsid w:val="5976550B"/>
     <w:multiLevelType w:val="hybridMultilevel"/>
     <w:tmpl w:val="240A1D74"/>
@@ -25775,7 +27672,7 @@
       </w:rPr>
     </w:lvl>
   </w:abstractNum>
-  <w:abstractNum w:abstractNumId="9" w15:restartNumberingAfterBreak="0">
+  <w:abstractNum w:abstractNumId="11" w15:restartNumberingAfterBreak="0">
     <w:nsid w:val="5A897D9C"/>
     <w:multiLevelType w:val="hybridMultilevel"/>
     <w:tmpl w:val="DD4400C2"/>
@@ -25864,7 +27761,7 @@
       </w:pPr>
     </w:lvl>
   </w:abstractNum>
-  <w:abstractNum w:abstractNumId="10" w15:restartNumberingAfterBreak="0">
+  <w:abstractNum w:abstractNumId="12" w15:restartNumberingAfterBreak="0">
     <w:nsid w:val="617B7779"/>
     <w:multiLevelType w:val="hybridMultilevel"/>
     <w:tmpl w:val="61E88196"/>
@@ -25953,7 +27850,7 @@
       </w:pPr>
     </w:lvl>
   </w:abstractNum>
-  <w:abstractNum w:abstractNumId="11" w15:restartNumberingAfterBreak="0">
+  <w:abstractNum w:abstractNumId="13" w15:restartNumberingAfterBreak="0">
     <w:nsid w:val="6BE32B57"/>
     <w:multiLevelType w:val="hybridMultilevel"/>
     <w:tmpl w:val="FD5EBA7C"/>
@@ -26042,7 +27939,7 @@
       </w:pPr>
     </w:lvl>
   </w:abstractNum>
-  <w:abstractNum w:abstractNumId="12" w15:restartNumberingAfterBreak="0">
+  <w:abstractNum w:abstractNumId="14" w15:restartNumberingAfterBreak="0">
     <w:nsid w:val="6F461F71"/>
     <w:multiLevelType w:val="multilevel"/>
     <w:tmpl w:val="0A42F81E"/>
@@ -26132,7 +28029,7 @@
       </w:pPr>
     </w:lvl>
   </w:abstractNum>
-  <w:abstractNum w:abstractNumId="13" w15:restartNumberingAfterBreak="0">
+  <w:abstractNum w:abstractNumId="15" w15:restartNumberingAfterBreak="0">
     <w:nsid w:val="70E66C38"/>
     <w:multiLevelType w:val="multilevel"/>
     <w:tmpl w:val="E53A7638"/>
@@ -26281,7 +28178,7 @@
       </w:rPr>
     </w:lvl>
   </w:abstractNum>
-  <w:abstractNum w:abstractNumId="14" w15:restartNumberingAfterBreak="0">
+  <w:abstractNum w:abstractNumId="16" w15:restartNumberingAfterBreak="0">
     <w:nsid w:val="718559BA"/>
     <w:multiLevelType w:val="multilevel"/>
     <w:tmpl w:val="FD4A90D4"/>
@@ -26430,7 +28327,7 @@
       </w:rPr>
     </w:lvl>
   </w:abstractNum>
-  <w:abstractNum w:abstractNumId="15" w15:restartNumberingAfterBreak="0">
+  <w:abstractNum w:abstractNumId="17" w15:restartNumberingAfterBreak="0">
     <w:nsid w:val="73D508BC"/>
     <w:multiLevelType w:val="hybridMultilevel"/>
     <w:tmpl w:val="A84E6652"/>
@@ -26519,7 +28416,7 @@
       </w:pPr>
     </w:lvl>
   </w:abstractNum>
-  <w:abstractNum w:abstractNumId="16" w15:restartNumberingAfterBreak="0">
+  <w:abstractNum w:abstractNumId="18" w15:restartNumberingAfterBreak="0">
     <w:nsid w:val="7614419F"/>
     <w:multiLevelType w:val="multilevel"/>
     <w:tmpl w:val="712C3CBA"/>
@@ -26664,7 +28561,7 @@
       </w:rPr>
     </w:lvl>
   </w:abstractNum>
-  <w:abstractNum w:abstractNumId="17" w15:restartNumberingAfterBreak="0">
+  <w:abstractNum w:abstractNumId="19" w15:restartNumberingAfterBreak="0">
     <w:nsid w:val="7EC10846"/>
     <w:multiLevelType w:val="hybridMultilevel"/>
     <w:tmpl w:val="6AE4087E"/>
@@ -26754,58 +28651,64 @@
     </w:lvl>
   </w:abstractNum>
   <w:num w:numId="1" w16cid:durableId="541869007">
-    <w:abstractNumId w:val="3"/>
+    <w:abstractNumId w:val="4"/>
   </w:num>
   <w:num w:numId="2" w16cid:durableId="462770144">
-    <w:abstractNumId w:val="15"/>
+    <w:abstractNumId w:val="17"/>
   </w:num>
   <w:num w:numId="3" w16cid:durableId="1471051309">
-    <w:abstractNumId w:val="6"/>
+    <w:abstractNumId w:val="7"/>
   </w:num>
   <w:num w:numId="4" w16cid:durableId="1343432061">
-    <w:abstractNumId w:val="4"/>
+    <w:abstractNumId w:val="5"/>
   </w:num>
   <w:num w:numId="5" w16cid:durableId="1458721374">
+    <w:abstractNumId w:val="16"/>
+  </w:num>
+  <w:num w:numId="6" w16cid:durableId="1529104964">
     <w:abstractNumId w:val="14"/>
   </w:num>
-  <w:num w:numId="6" w16cid:durableId="1529104964">
+  <w:num w:numId="7" w16cid:durableId="1058094058">
     <w:abstractNumId w:val="12"/>
   </w:num>
-  <w:num w:numId="7" w16cid:durableId="1058094058">
-    <w:abstractNumId w:val="10"/>
-  </w:num>
   <w:num w:numId="8" w16cid:durableId="1727214589">
-    <w:abstractNumId w:val="7"/>
+    <w:abstractNumId w:val="9"/>
   </w:num>
   <w:num w:numId="9" w16cid:durableId="2144538799">
     <w:abstractNumId w:val="2"/>
   </w:num>
   <w:num w:numId="10" w16cid:durableId="1542979681">
+    <w:abstractNumId w:val="15"/>
+  </w:num>
+  <w:num w:numId="11" w16cid:durableId="386104398">
     <w:abstractNumId w:val="13"/>
   </w:num>
-  <w:num w:numId="11" w16cid:durableId="386104398">
-    <w:abstractNumId w:val="11"/>
-  </w:num>
   <w:num w:numId="12" w16cid:durableId="1477409177">
-    <w:abstractNumId w:val="17"/>
+    <w:abstractNumId w:val="19"/>
   </w:num>
   <w:num w:numId="13" w16cid:durableId="1840733203">
-    <w:abstractNumId w:val="16"/>
+    <w:abstractNumId w:val="18"/>
   </w:num>
   <w:num w:numId="14" w16cid:durableId="214390461">
     <w:abstractNumId w:val="0"/>
   </w:num>
   <w:num w:numId="15" w16cid:durableId="1266646685">
-    <w:abstractNumId w:val="8"/>
+    <w:abstractNumId w:val="10"/>
   </w:num>
   <w:num w:numId="16" w16cid:durableId="1697928031">
-    <w:abstractNumId w:val="5"/>
+    <w:abstractNumId w:val="6"/>
   </w:num>
   <w:num w:numId="17" w16cid:durableId="1642342788">
-    <w:abstractNumId w:val="9"/>
+    <w:abstractNumId w:val="11"/>
   </w:num>
   <w:num w:numId="18" w16cid:durableId="629482002">
     <w:abstractNumId w:val="1"/>
+  </w:num>
+  <w:num w:numId="19" w16cid:durableId="980187558">
+    <w:abstractNumId w:val="3"/>
+  </w:num>
+  <w:num w:numId="20" w16cid:durableId="1541741658">
+    <w:abstractNumId w:val="8"/>
   </w:num>
 </w:numbering>
 </file>
@@ -27801,6 +29704,17 @@
       <w:spacing w:after="0" w:line="240" w:lineRule="auto"/>
     </w:pPr>
   </w:style>
+  <w:style w:type="character" w:styleId="Strong">
+    <w:name w:val="Strong"/>
+    <w:basedOn w:val="DefaultParagraphFont"/>
+    <w:uiPriority w:val="22"/>
+    <w:qFormat/>
+    <w:rsid w:val="00A83B7B"/>
+    <w:rPr>
+      <w:b/>
+      <w:bCs/>
+    </w:rPr>
+  </w:style>
 </w:styles>
 </file>
 

</xml_diff>